<commit_message>
pequena edição pra cardoso
</commit_message>
<xml_diff>
--- a/resources/templates/desfiliacao_4.docx
+++ b/resources/templates/desfiliacao_4.docx
@@ -271,6 +271,11 @@
     <w:p>
       <w:pPr>
         <w:jc w:val="center"/>
+        <w:rPr>
+          <w:b/>
+          <w:sz w:val="20"/>
+          <w:szCs w:val="20"/>
+        </w:rPr>
       </w:pPr>
       <w:r>
         <w:rPr>
@@ -319,8 +324,51 @@
           <w:sz w:val="20"/>
           <w:szCs w:val="20"/>
         </w:rPr>
-        <w:tab/>
-      </w:r>
+        <w:t xml:space="preserve">                </w:t>
+      </w:r>
+      <w:proofErr w:type="spellStart"/>
+      <w:r>
+        <w:rPr>
+          <w:b/>
+          <w:i/>
+          <w:sz w:val="22"/>
+          <w:szCs w:val="22"/>
+        </w:rPr>
+        <w:t>Cel</w:t>
+      </w:r>
+      <w:proofErr w:type="spellEnd"/>
+      <w:r>
+        <w:rPr>
+          <w:b/>
+          <w:i/>
+          <w:sz w:val="22"/>
+          <w:szCs w:val="22"/>
+        </w:rPr>
+        <w:t>:</w:t>
+      </w:r>
+      <w:r>
+        <w:rPr>
+          <w:b/>
+          <w:sz w:val="22"/>
+          <w:szCs w:val="22"/>
+        </w:rPr>
+        <w:t xml:space="preserve"> </w:t>
+      </w:r>
+      <w:r>
+        <w:rPr>
+          <w:b/>
+          <w:i/>
+          <w:sz w:val="22"/>
+          <w:szCs w:val="22"/>
+        </w:rPr>
+        <w:t>(17)9 9643-9188</w:t>
+      </w:r>
+    </w:p>
+    <w:p>
+      <w:pPr>
+        <w:ind w:left="1416"/>
+        <w:jc w:val="center"/>
+      </w:pPr>
       <w:r>
         <w:rPr>
           <w:rFonts w:ascii="Monotype Corsiva" w:hAnsi="Monotype Corsiva" w:cs="Monotype Corsiva"/>

</xml_diff>

<commit_message>
editei mais do cardoso se nao for o caso reseta
</commit_message>
<xml_diff>
--- a/resources/templates/desfiliacao_4.docx
+++ b/resources/templates/desfiliacao_4.docx
@@ -175,6 +175,11 @@
     <w:p>
       <w:pPr>
         <w:jc w:val="center"/>
+        <w:rPr>
+          <w:b/>
+          <w:sz w:val="20"/>
+          <w:szCs w:val="20"/>
+        </w:rPr>
       </w:pPr>
       <w:r>
         <w:rPr>
@@ -198,84 +203,117 @@
           <w:sz w:val="20"/>
           <w:szCs w:val="20"/>
         </w:rPr>
+        <w:t xml:space="preserve">           </w:t>
+      </w:r>
+      <w:r>
+        <w:rPr>
+          <w:b/>
+          <w:sz w:val="20"/>
+          <w:szCs w:val="20"/>
+        </w:rPr>
+        <w:t>FRONTEIRA E REGIÃO “CHICO SIMPLÍCIO” Z-14</w:t>
+      </w:r>
+      <w:r>
+        <w:rPr>
+          <w:b/>
+          <w:sz w:val="20"/>
+          <w:szCs w:val="20"/>
+        </w:rPr>
+        <w:t xml:space="preserve"> </w:t>
+      </w:r>
+    </w:p>
+    <w:p>
+      <w:pPr>
+        <w:jc w:val="center"/>
+        <w:rPr>
+          <w:b/>
+          <w:sz w:val="20"/>
+          <w:szCs w:val="20"/>
+        </w:rPr>
+      </w:pPr>
+      <w:r>
+        <w:rPr>
+          <w:b/>
+          <w:sz w:val="20"/>
+          <w:szCs w:val="20"/>
+        </w:rPr>
+        <w:t xml:space="preserve">                    COM ATENDIMENTO EM CARDOSO-SP</w:t>
+      </w:r>
+    </w:p>
+    <w:p>
+      <w:pPr>
+        <w:jc w:val="center"/>
+      </w:pPr>
+    </w:p>
+    <w:p>
+      <w:pPr>
+        <w:jc w:val="center"/>
+        <w:rPr>
+          <w:b/>
+          <w:sz w:val="20"/>
+          <w:szCs w:val="20"/>
+        </w:rPr>
+      </w:pPr>
+      <w:r>
+        <w:rPr>
+          <w:b/>
+          <w:sz w:val="20"/>
+          <w:szCs w:val="20"/>
+        </w:rPr>
         <w:tab/>
-        <w:t>FRONTEIRA E REGIÃO “CHICO SIMPLÍCIO” Z-14</w:t>
+      </w:r>
+      <w:r>
+        <w:rPr>
+          <w:b/>
+          <w:sz w:val="20"/>
+          <w:szCs w:val="20"/>
+        </w:rPr>
+        <w:tab/>
+      </w:r>
+      <w:r>
+        <w:rPr>
+          <w:b/>
+          <w:sz w:val="20"/>
+          <w:szCs w:val="20"/>
+        </w:rPr>
+        <w:tab/>
+      </w:r>
+      <w:r>
+        <w:rPr>
+          <w:b/>
+          <w:sz w:val="20"/>
+          <w:szCs w:val="20"/>
+        </w:rPr>
+        <w:t>Avenida João Gonçalves do Nascimento, 1015</w:t>
+      </w:r>
+      <w:r>
+        <w:rPr>
+          <w:b/>
+          <w:sz w:val="20"/>
+          <w:szCs w:val="20"/>
+        </w:rPr>
+        <w:t xml:space="preserve"> </w:t>
+      </w:r>
+      <w:r>
+        <w:rPr>
+          <w:b/>
+          <w:sz w:val="20"/>
+          <w:szCs w:val="20"/>
+        </w:rPr>
+        <w:t xml:space="preserve">– </w:t>
+      </w:r>
+      <w:r>
+        <w:rPr>
+          <w:b/>
+          <w:sz w:val="20"/>
+          <w:szCs w:val="20"/>
+        </w:rPr>
+        <w:t>Centro</w:t>
       </w:r>
     </w:p>
     <w:p>
       <w:pPr>
         <w:jc w:val="center"/>
-        <w:rPr>
-          <w:b/>
-          <w:sz w:val="20"/>
-          <w:szCs w:val="20"/>
-        </w:rPr>
-      </w:pPr>
-      <w:r>
-        <w:rPr>
-          <w:b/>
-          <w:sz w:val="20"/>
-          <w:szCs w:val="20"/>
-        </w:rPr>
-        <w:tab/>
-      </w:r>
-      <w:r>
-        <w:rPr>
-          <w:b/>
-          <w:sz w:val="20"/>
-          <w:szCs w:val="20"/>
-        </w:rPr>
-        <w:tab/>
-      </w:r>
-      <w:r>
-        <w:rPr>
-          <w:b/>
-          <w:sz w:val="20"/>
-          <w:szCs w:val="20"/>
-        </w:rPr>
-        <w:tab/>
-      </w:r>
-      <w:r>
-        <w:rPr>
-          <w:b/>
-          <w:sz w:val="20"/>
-          <w:szCs w:val="20"/>
-        </w:rPr>
-        <w:t>Avenida João Gonçalves do Nascimento, 1015</w:t>
-      </w:r>
-      <w:r>
-        <w:rPr>
-          <w:b/>
-          <w:sz w:val="20"/>
-          <w:szCs w:val="20"/>
-        </w:rPr>
-        <w:t xml:space="preserve"> </w:t>
-      </w:r>
-      <w:r>
-        <w:rPr>
-          <w:b/>
-          <w:sz w:val="20"/>
-          <w:szCs w:val="20"/>
-        </w:rPr>
-        <w:t xml:space="preserve">– </w:t>
-      </w:r>
-      <w:r>
-        <w:rPr>
-          <w:b/>
-          <w:sz w:val="20"/>
-          <w:szCs w:val="20"/>
-        </w:rPr>
-        <w:t>Centro</w:t>
-      </w:r>
-    </w:p>
-    <w:p>
-      <w:pPr>
-        <w:jc w:val="center"/>
-        <w:rPr>
-          <w:b/>
-          <w:sz w:val="20"/>
-          <w:szCs w:val="20"/>
-        </w:rPr>
       </w:pPr>
       <w:r>
         <w:rPr>
@@ -363,12 +401,6 @@
         </w:rPr>
         <w:t>(17)9 9643-9188</w:t>
       </w:r>
-    </w:p>
-    <w:p>
-      <w:pPr>
-        <w:ind w:left="1416"/>
-        <w:jc w:val="center"/>
-      </w:pPr>
       <w:r>
         <w:rPr>
           <w:rFonts w:ascii="Monotype Corsiva" w:hAnsi="Monotype Corsiva" w:cs="Monotype Corsiva"/>
@@ -377,7 +409,7 @@
           <w:sz w:val="22"/>
           <w:szCs w:val="22"/>
         </w:rPr>
-        <w:t xml:space="preserve">Tel./ (0xx34) 3428-2069      </w:t>
+        <w:t xml:space="preserve"> </w:t>
       </w:r>
     </w:p>
     <w:p>
@@ -386,8 +418,6 @@
           <w:tab w:val="left" w:pos="1263"/>
           <w:tab w:val="center" w:pos="4472"/>
         </w:tabs>
-      </w:pPr>
-      <w:r>
         <w:rPr>
           <w:rFonts w:ascii="Monotype Corsiva" w:hAnsi="Monotype Corsiva" w:cs="Monotype Corsiva"/>
           <w:b/>
@@ -395,8 +425,7 @@
           <w:sz w:val="22"/>
           <w:szCs w:val="22"/>
         </w:rPr>
-        <w:tab/>
-      </w:r>
+      </w:pPr>
       <w:r>
         <w:rPr>
           <w:rFonts w:ascii="Monotype Corsiva" w:hAnsi="Monotype Corsiva" w:cs="Monotype Corsiva"/>
@@ -406,9 +435,7 @@
           <w:szCs w:val="22"/>
         </w:rPr>
         <w:tab/>
-        <w:t xml:space="preserve">                       </w:t>
-      </w:r>
-      <w:proofErr w:type="gramStart"/>
+      </w:r>
       <w:r>
         <w:rPr>
           <w:rFonts w:ascii="Monotype Corsiva" w:hAnsi="Monotype Corsiva" w:cs="Monotype Corsiva"/>
@@ -417,9 +444,10 @@
           <w:sz w:val="22"/>
           <w:szCs w:val="22"/>
         </w:rPr>
-        <w:t>CNPJ  nº</w:t>
-      </w:r>
-      <w:proofErr w:type="gramEnd"/>
+        <w:tab/>
+        <w:t xml:space="preserve">                       </w:t>
+      </w:r>
+      <w:proofErr w:type="gramStart"/>
       <w:r>
         <w:rPr>
           <w:rFonts w:ascii="Monotype Corsiva" w:hAnsi="Monotype Corsiva" w:cs="Monotype Corsiva"/>
@@ -428,7 +456,65 @@
           <w:sz w:val="22"/>
           <w:szCs w:val="22"/>
         </w:rPr>
+        <w:t>CNPJ  nº</w:t>
+      </w:r>
+      <w:proofErr w:type="gramEnd"/>
+      <w:r>
+        <w:rPr>
+          <w:rFonts w:ascii="Monotype Corsiva" w:hAnsi="Monotype Corsiva" w:cs="Monotype Corsiva"/>
+          <w:b/>
+          <w:i/>
+          <w:sz w:val="22"/>
+          <w:szCs w:val="22"/>
+        </w:rPr>
         <w:t>. 04.247.647 / 0001-73</w:t>
+      </w:r>
+    </w:p>
+    <w:p>
+      <w:pPr>
+        <w:pStyle w:val="FrameContents"/>
+        <w:tabs>
+          <w:tab w:val="left" w:pos="1263"/>
+          <w:tab w:val="center" w:pos="4472"/>
+        </w:tabs>
+        <w:jc w:val="center"/>
+        <w:rPr>
+          <w:rFonts w:ascii="Monotype Corsiva" w:hAnsi="Monotype Corsiva" w:cs="Monotype Corsiva"/>
+          <w:b/>
+          <w:i/>
+          <w:sz w:val="22"/>
+          <w:szCs w:val="22"/>
+        </w:rPr>
+      </w:pPr>
+      <w:r>
+        <w:rPr>
+          <w:rFonts w:ascii="Monotype Corsiva" w:hAnsi="Monotype Corsiva" w:cs="Monotype Corsiva"/>
+          <w:b/>
+          <w:i/>
+          <w:sz w:val="22"/>
+          <w:szCs w:val="22"/>
+        </w:rPr>
+        <w:t xml:space="preserve">                             </w:t>
+      </w:r>
+      <w:r>
+        <w:rPr>
+          <w:rFonts w:ascii="Monotype Corsiva" w:hAnsi="Monotype Corsiva" w:cs="Monotype Corsiva"/>
+          <w:b/>
+          <w:i/>
+          <w:sz w:val="22"/>
+          <w:szCs w:val="22"/>
+        </w:rPr>
+        <w:t xml:space="preserve">Email: </w:t>
+      </w:r>
+      <w:r>
+        <w:rPr>
+          <w:rFonts w:ascii="Monotype Corsiva" w:hAnsi="Monotype Corsiva" w:cs="Monotype Corsiva"/>
+          <w:b/>
+          <w:i/>
+          <w:sz w:val="22"/>
+          <w:szCs w:val="22"/>
+        </w:rPr>
+        <w:t>coloniacardosoz-14@hotmail.com</w:t>
       </w:r>
     </w:p>
     <w:p>
@@ -1190,6 +1276,7 @@
   <w:style w:type="character" w:default="1" w:styleId="Fontepargpadro">
     <w:name w:val="Default Paragraph Font"/>
     <w:uiPriority w:val="1"/>
+    <w:semiHidden/>
     <w:unhideWhenUsed/>
   </w:style>
   <w:style w:type="table" w:default="1" w:styleId="Tabelanormal">

</xml_diff>

<commit_message>
mudei o numero de telefone de cardoso
</commit_message>
<xml_diff>
--- a/resources/templates/desfiliacao_4.docx
+++ b/resources/templates/desfiliacao_4.docx
@@ -399,7 +399,7 @@
           <w:sz w:val="22"/>
           <w:szCs w:val="22"/>
         </w:rPr>
-        <w:t>(17)9 9643-9188</w:t>
+        <w:t>(17)9 9166-1933</w:t>
       </w:r>
       <w:r>
         <w:rPr>
@@ -445,29 +445,7 @@
           <w:szCs w:val="22"/>
         </w:rPr>
         <w:tab/>
-        <w:t xml:space="preserve">                       </w:t>
-      </w:r>
-      <w:proofErr w:type="gramStart"/>
-      <w:r>
-        <w:rPr>
-          <w:rFonts w:ascii="Monotype Corsiva" w:hAnsi="Monotype Corsiva" w:cs="Monotype Corsiva"/>
-          <w:b/>
-          <w:i/>
-          <w:sz w:val="22"/>
-          <w:szCs w:val="22"/>
-        </w:rPr>
-        <w:t>CNPJ  nº</w:t>
-      </w:r>
-      <w:proofErr w:type="gramEnd"/>
-      <w:r>
-        <w:rPr>
-          <w:rFonts w:ascii="Monotype Corsiva" w:hAnsi="Monotype Corsiva" w:cs="Monotype Corsiva"/>
-          <w:b/>
-          <w:i/>
-          <w:sz w:val="22"/>
-          <w:szCs w:val="22"/>
-        </w:rPr>
-        <w:t>. 04.247.647 / 0001-73</w:t>
+        <w:t xml:space="preserve">                       CNPJ  nº. 04.247.647 / 0001-73</w:t>
       </w:r>
     </w:p>
     <w:p>
@@ -494,7 +472,7 @@
           <w:sz w:val="22"/>
           <w:szCs w:val="22"/>
         </w:rPr>
-        <w:t xml:space="preserve">                             </w:t>
+        <w:t xml:space="preserve">                             Email: </w:t>
       </w:r>
       <w:r>
         <w:rPr>
@@ -504,23 +482,23 @@
           <w:sz w:val="22"/>
           <w:szCs w:val="22"/>
         </w:rPr>
-        <w:t xml:space="preserve">Email: </w:t>
-      </w:r>
-      <w:r>
-        <w:rPr>
-          <w:rFonts w:ascii="Monotype Corsiva" w:hAnsi="Monotype Corsiva" w:cs="Monotype Corsiva"/>
+        <w:t>coloniacardosoz-14@hotmail.com</w:t>
+      </w:r>
+    </w:p>
+    <w:p>
+      <w:pPr>
+        <w:jc w:val="center"/>
+      </w:pPr>
+      <w:r>
+        <w:rPr>
+          <w:rFonts w:ascii="Monotype Corsiva" w:eastAsia="Monotype Corsiva" w:hAnsi="Monotype Corsiva" w:cs="Monotype Corsiva"/>
           <w:b/>
           <w:i/>
           <w:sz w:val="22"/>
           <w:szCs w:val="22"/>
         </w:rPr>
-        <w:t>coloniacardosoz-14@hotmail.com</w:t>
-      </w:r>
-    </w:p>
-    <w:p>
-      <w:pPr>
-        <w:jc w:val="center"/>
-      </w:pPr>
+        <w:tab/>
+      </w:r>
       <w:r>
         <w:rPr>
           <w:rFonts w:ascii="Monotype Corsiva" w:eastAsia="Monotype Corsiva" w:hAnsi="Monotype Corsiva" w:cs="Monotype Corsiva"/>
@@ -530,26 +508,16 @@
           <w:szCs w:val="22"/>
         </w:rPr>
         <w:tab/>
-      </w:r>
-      <w:r>
-        <w:rPr>
-          <w:rFonts w:ascii="Monotype Corsiva" w:eastAsia="Monotype Corsiva" w:hAnsi="Monotype Corsiva" w:cs="Monotype Corsiva"/>
+        <w:t>P</w:t>
+      </w:r>
+      <w:r>
+        <w:rPr>
+          <w:rFonts w:ascii="Monotype Corsiva" w:hAnsi="Monotype Corsiva" w:cs="Monotype Corsiva"/>
           <w:b/>
           <w:i/>
           <w:sz w:val="22"/>
           <w:szCs w:val="22"/>
         </w:rPr>
-        <w:tab/>
-        <w:t>P</w:t>
-      </w:r>
-      <w:r>
-        <w:rPr>
-          <w:rFonts w:ascii="Monotype Corsiva" w:hAnsi="Monotype Corsiva" w:cs="Monotype Corsiva"/>
-          <w:b/>
-          <w:i/>
-          <w:sz w:val="22"/>
-          <w:szCs w:val="22"/>
-        </w:rPr>
         <w:t xml:space="preserve">residente – </w:t>
       </w:r>
       <w:r>
@@ -704,18 +672,8 @@
           <w:sz w:val="40"/>
           <w:szCs w:val="40"/>
         </w:rPr>
-        <w:t xml:space="preserve">, está com todas as suas obrigações de sócio em </w:t>
-      </w:r>
-      <w:proofErr w:type="gramStart"/>
-      <w:r>
-        <w:rPr>
-          <w:rFonts w:ascii="Monotype Corsiva" w:hAnsi="Monotype Corsiva"/>
-          <w:sz w:val="40"/>
-          <w:szCs w:val="40"/>
-        </w:rPr>
-        <w:t>dia .</w:t>
-      </w:r>
-      <w:proofErr w:type="gramEnd"/>
+        <w:t>, está com todas as suas obrigações de sócio em dia .</w:t>
+      </w:r>
     </w:p>
     <w:p>
       <w:pPr>

</xml_diff>